<commit_message>
Mise à jour app + Supabase + Test
</commit_message>
<xml_diff>
--- a/Math Education/Spécifications site web et BD/PageSiteWeb.docx
+++ b/Math Education/Spécifications site web et BD/PageSiteWeb.docx
@@ -2,7 +2,687 @@
 <file path=word/document.xml><?xml version="1.0" encoding="utf-8"?>
 <w:document xmlns:wpc="http://schemas.microsoft.com/office/word/2010/wordprocessingCanvas" xmlns:cx="http://schemas.microsoft.com/office/drawing/2014/chartex" xmlns:cx1="http://schemas.microsoft.com/office/drawing/2015/9/8/chartex" xmlns:cx2="http://schemas.microsoft.com/office/drawing/2015/10/21/chartex" xmlns:cx3="http://schemas.microsoft.com/office/drawing/2016/5/9/chartex" xmlns:cx4="http://schemas.microsoft.com/office/drawing/2016/5/10/chartex" xmlns:cx5="http://schemas.microsoft.com/office/drawing/2016/5/11/chartex" xmlns:cx6="http://schemas.microsoft.com/office/drawing/2016/5/12/chartex" xmlns:cx7="http://schemas.microsoft.com/office/drawing/2016/5/13/chartex" xmlns:cx8="http://schemas.microsoft.com/office/drawing/2016/5/14/chartex" xmlns:mc="http://schemas.openxmlformats.org/markup-compatibility/2006" xmlns:aink="http://schemas.microsoft.com/office/drawing/2016/ink" xmlns:am3d="http://schemas.microsoft.com/office/drawing/2017/model3d" xmlns:o="urn:schemas-microsoft-com:office:office" xmlns:oel="http://schemas.microsoft.com/office/2019/extlst" xmlns:r="http://schemas.openxmlformats.org/officeDocument/2006/relationships" xmlns:m="http://schemas.openxmlformats.org/officeDocument/2006/math" xmlns:v="urn:schemas-microsoft-com:vml" xmlns:wp14="http://schemas.microsoft.com/office/word/2010/wordprocessingDrawing" xmlns:wp="http://schemas.openxmlformats.org/drawingml/2006/wordprocessingDrawing" xmlns:w10="urn:schemas-microsoft-com:office:word" xmlns:w="http://schemas.openxmlformats.org/wordprocessingml/2006/main" xmlns:w14="http://schemas.microsoft.com/office/word/2010/wordml" xmlns:w15="http://schemas.microsoft.com/office/word/2012/wordml" xmlns:w16cex="http://schemas.microsoft.com/office/word/2018/wordml/cex" xmlns:w16cid="http://schemas.microsoft.com/office/word/2016/wordml/cid" xmlns:w16="http://schemas.microsoft.com/office/word/2018/wordml" xmlns:w16du="http://schemas.microsoft.com/office/word/2023/wordml/word16du" xmlns:w16sdtdh="http://schemas.microsoft.com/office/word/2020/wordml/sdtdatahash" xmlns:w16sdtfl="http://schemas.microsoft.com/office/word/2024/wordml/sdtformatlock" xmlns:w16se="http://schemas.microsoft.com/office/word/2015/wordml/symex" xmlns:wpg="http://schemas.microsoft.com/office/word/2010/wordprocessingGroup" xmlns:wpi="http://schemas.microsoft.com/office/word/2010/wordprocessingInk" xmlns:wne="http://schemas.microsoft.com/office/word/2006/wordml" xmlns:wps="http://schemas.microsoft.com/office/word/2010/wordprocessingShape" mc:Ignorable="w14 w15 w16se w16cid w16 w16cex w16sdtdh w16sdtfl w16du wp14">
   <w:body>
+    <w:p>
+      <w:pPr>
+        <w:jc w:val="center"/>
+        <w:rPr>
+          <w:b/>
+          <w:bCs/>
+          <w:u w:val="single"/>
+        </w:rPr>
+      </w:pPr>
+      <w:r>
+        <w:rPr>
+          <w:b/>
+          <w:bCs/>
+          <w:u w:val="single"/>
+        </w:rPr>
+        <w:t>Page Site Web</w:t>
+      </w:r>
+      <w:r>
+        <w:rPr>
+          <w:b/>
+          <w:bCs/>
+          <w:u w:val="single"/>
+        </w:rPr>
+        <w:t> :</w:t>
+      </w:r>
+    </w:p>
+    <w:p>
+      <w:pPr>
+        <w:rPr>
+          <w:b/>
+          <w:bCs/>
+          <w:u w:val="single"/>
+        </w:rPr>
+      </w:pPr>
+      <w:r>
+        <w:rPr>
+          <w:b/>
+          <w:bCs/>
+          <w:u w:val="single"/>
+        </w:rPr>
+        <w:t xml:space="preserve">Page Tape à l’œil avec possibilité de connexion : </w:t>
+      </w:r>
+    </w:p>
+    <w:p>
+      <w:pPr>
+        <w:rPr>
+          <w:b/>
+          <w:bCs/>
+          <w:u w:val="single"/>
+        </w:rPr>
+      </w:pPr>
+      <w:r>
+        <w:rPr>
+          <w:b/>
+          <w:bCs/>
+          <w:u w:val="single"/>
+        </w:rPr>
+        <w:t xml:space="preserve">Avec plusieurs </w:t>
+      </w:r>
+      <w:proofErr w:type="spellStart"/>
+      <w:r>
+        <w:rPr>
+          <w:b/>
+          <w:bCs/>
+          <w:u w:val="single"/>
+        </w:rPr>
+        <w:t>hooks</w:t>
+      </w:r>
+      <w:proofErr w:type="spellEnd"/>
+      <w:r>
+        <w:rPr>
+          <w:b/>
+          <w:bCs/>
+          <w:u w:val="single"/>
+        </w:rPr>
+        <w:t xml:space="preserve"> : </w:t>
+      </w:r>
+    </w:p>
+    <w:p>
+      <w:pPr>
+        <w:rPr>
+          <w:b/>
+          <w:bCs/>
+          <w:u w:val="single"/>
+        </w:rPr>
+      </w:pPr>
+      <w:r>
+        <w:rPr>
+          <w:b/>
+          <w:bCs/>
+          <w:u w:val="single"/>
+        </w:rPr>
+        <w:t>Ce que propose la plateforme</w:t>
+      </w:r>
+    </w:p>
+    <w:p>
+      <w:pPr>
+        <w:rPr>
+          <w:b/>
+          <w:bCs/>
+          <w:u w:val="single"/>
+        </w:rPr>
+      </w:pPr>
+      <w:r>
+        <w:rPr>
+          <w:b/>
+          <w:bCs/>
+          <w:u w:val="single"/>
+        </w:rPr>
+        <w:drawing>
+          <wp:inline distT="0" distB="0" distL="0" distR="0" wp14:anchorId="1E62578D" wp14:editId="1E48BE69">
+            <wp:extent cx="5760720" cy="2790190"/>
+            <wp:effectExtent l="0" t="0" r="0" b="0"/>
+            <wp:docPr id="1409474048" name="Image 1"/>
+            <wp:cNvGraphicFramePr>
+              <a:graphicFrameLocks xmlns:a="http://schemas.openxmlformats.org/drawingml/2006/main" noChangeAspect="1"/>
+            </wp:cNvGraphicFramePr>
+            <a:graphic xmlns:a="http://schemas.openxmlformats.org/drawingml/2006/main">
+              <a:graphicData uri="http://schemas.openxmlformats.org/drawingml/2006/picture">
+                <pic:pic xmlns:pic="http://schemas.openxmlformats.org/drawingml/2006/picture">
+                  <pic:nvPicPr>
+                    <pic:cNvPr id="1409474048" name=""/>
+                    <pic:cNvPicPr/>
+                  </pic:nvPicPr>
+                  <pic:blipFill>
+                    <a:blip r:embed="rId6"/>
+                    <a:stretch>
+                      <a:fillRect/>
+                    </a:stretch>
+                  </pic:blipFill>
+                  <pic:spPr>
+                    <a:xfrm>
+                      <a:off x="0" y="0"/>
+                      <a:ext cx="5760720" cy="2790190"/>
+                    </a:xfrm>
+                    <a:prstGeom prst="rect">
+                      <a:avLst/>
+                    </a:prstGeom>
+                  </pic:spPr>
+                </pic:pic>
+              </a:graphicData>
+            </a:graphic>
+          </wp:inline>
+        </w:drawing>
+      </w:r>
+    </w:p>
+    <w:p>
+      <w:pPr>
+        <w:rPr>
+          <w:b/>
+          <w:bCs/>
+          <w:u w:val="single"/>
+        </w:rPr>
+      </w:pPr>
+      <w:r>
+        <w:rPr>
+          <w:b/>
+          <w:bCs/>
+          <w:u w:val="single"/>
+        </w:rPr>
+        <w:t xml:space="preserve">Les prix : </w:t>
+      </w:r>
+    </w:p>
+    <w:p>
+      <w:r>
+        <w:rPr>
+          <w:b/>
+          <w:bCs/>
+          <w:u w:val="single"/>
+        </w:rPr>
+        <w:drawing>
+          <wp:inline distT="0" distB="0" distL="0" distR="0" wp14:anchorId="38D28173" wp14:editId="6540B783">
+            <wp:extent cx="5760720" cy="3949700"/>
+            <wp:effectExtent l="0" t="0" r="0" b="0"/>
+            <wp:docPr id="1284640232" name="Image 1"/>
+            <wp:cNvGraphicFramePr>
+              <a:graphicFrameLocks xmlns:a="http://schemas.openxmlformats.org/drawingml/2006/main" noChangeAspect="1"/>
+            </wp:cNvGraphicFramePr>
+            <a:graphic xmlns:a="http://schemas.openxmlformats.org/drawingml/2006/main">
+              <a:graphicData uri="http://schemas.openxmlformats.org/drawingml/2006/picture">
+                <pic:pic xmlns:pic="http://schemas.openxmlformats.org/drawingml/2006/picture">
+                  <pic:nvPicPr>
+                    <pic:cNvPr id="1284640232" name=""/>
+                    <pic:cNvPicPr/>
+                  </pic:nvPicPr>
+                  <pic:blipFill>
+                    <a:blip r:embed="rId7"/>
+                    <a:stretch>
+                      <a:fillRect/>
+                    </a:stretch>
+                  </pic:blipFill>
+                  <pic:spPr>
+                    <a:xfrm>
+                      <a:off x="0" y="0"/>
+                      <a:ext cx="5760720" cy="3949700"/>
+                    </a:xfrm>
+                    <a:prstGeom prst="rect">
+                      <a:avLst/>
+                    </a:prstGeom>
+                  </pic:spPr>
+                </pic:pic>
+              </a:graphicData>
+            </a:graphic>
+          </wp:inline>
+        </w:drawing>
+      </w:r>
+    </w:p>
     <w:p/>
+    <w:p>
+      <w:pPr>
+        <w:rPr>
+          <w:b/>
+          <w:bCs/>
+          <w:u w:val="single"/>
+        </w:rPr>
+      </w:pPr>
+      <w:r>
+        <w:rPr>
+          <w:b/>
+          <w:bCs/>
+          <w:u w:val="single"/>
+        </w:rPr>
+        <w:lastRenderedPageBreak/>
+        <w:t xml:space="preserve">Stripe : Page de paiement : </w:t>
+      </w:r>
+    </w:p>
+    <w:p>
+      <w:r>
+        <w:drawing>
+          <wp:inline distT="0" distB="0" distL="0" distR="0" wp14:anchorId="3DC34846" wp14:editId="07519298">
+            <wp:extent cx="5760720" cy="3683000"/>
+            <wp:effectExtent l="0" t="0" r="0" b="0"/>
+            <wp:docPr id="1982885914" name="Image 1"/>
+            <wp:cNvGraphicFramePr>
+              <a:graphicFrameLocks xmlns:a="http://schemas.openxmlformats.org/drawingml/2006/main" noChangeAspect="1"/>
+            </wp:cNvGraphicFramePr>
+            <a:graphic xmlns:a="http://schemas.openxmlformats.org/drawingml/2006/main">
+              <a:graphicData uri="http://schemas.openxmlformats.org/drawingml/2006/picture">
+                <pic:pic xmlns:pic="http://schemas.openxmlformats.org/drawingml/2006/picture">
+                  <pic:nvPicPr>
+                    <pic:cNvPr id="1982885914" name=""/>
+                    <pic:cNvPicPr/>
+                  </pic:nvPicPr>
+                  <pic:blipFill>
+                    <a:blip r:embed="rId8"/>
+                    <a:stretch>
+                      <a:fillRect/>
+                    </a:stretch>
+                  </pic:blipFill>
+                  <pic:spPr>
+                    <a:xfrm>
+                      <a:off x="0" y="0"/>
+                      <a:ext cx="5760720" cy="3683000"/>
+                    </a:xfrm>
+                    <a:prstGeom prst="rect">
+                      <a:avLst/>
+                    </a:prstGeom>
+                  </pic:spPr>
+                </pic:pic>
+              </a:graphicData>
+            </a:graphic>
+          </wp:inline>
+        </w:drawing>
+      </w:r>
+    </w:p>
+    <w:p/>
+    <w:p>
+      <w:pPr>
+        <w:rPr>
+          <w:b/>
+          <w:bCs/>
+          <w:u w:val="single"/>
+        </w:rPr>
+      </w:pPr>
+      <w:r>
+        <w:rPr>
+          <w:b/>
+          <w:bCs/>
+          <w:u w:val="single"/>
+        </w:rPr>
+        <w:t>Les avis d’étudiants et de prof</w:t>
+      </w:r>
+    </w:p>
+    <w:p>
+      <w:pPr>
+        <w:rPr>
+          <w:b/>
+          <w:bCs/>
+          <w:u w:val="single"/>
+        </w:rPr>
+      </w:pPr>
+      <w:r>
+        <w:rPr>
+          <w:b/>
+          <w:bCs/>
+          <w:u w:val="single"/>
+        </w:rPr>
+        <w:t xml:space="preserve">Page de connexion / </w:t>
+      </w:r>
+      <w:r>
+        <w:rPr>
+          <w:b/>
+          <w:bCs/>
+          <w:u w:val="single"/>
+        </w:rPr>
+        <w:t>identification :</w:t>
+      </w:r>
+    </w:p>
+    <w:p>
+      <w:pPr>
+        <w:rPr>
+          <w:b/>
+          <w:bCs/>
+          <w:u w:val="single"/>
+        </w:rPr>
+      </w:pPr>
+      <w:r>
+        <w:rPr>
+          <w:b/>
+          <w:bCs/>
+          <w:u w:val="single"/>
+        </w:rPr>
+        <w:drawing>
+          <wp:inline distT="0" distB="0" distL="0" distR="0" wp14:anchorId="11C60BFE" wp14:editId="1EA4187D">
+            <wp:extent cx="5760720" cy="3528060"/>
+            <wp:effectExtent l="0" t="0" r="0" b="0"/>
+            <wp:docPr id="427608400" name="Image 1"/>
+            <wp:cNvGraphicFramePr>
+              <a:graphicFrameLocks xmlns:a="http://schemas.openxmlformats.org/drawingml/2006/main" noChangeAspect="1"/>
+            </wp:cNvGraphicFramePr>
+            <a:graphic xmlns:a="http://schemas.openxmlformats.org/drawingml/2006/main">
+              <a:graphicData uri="http://schemas.openxmlformats.org/drawingml/2006/picture">
+                <pic:pic xmlns:pic="http://schemas.openxmlformats.org/drawingml/2006/picture">
+                  <pic:nvPicPr>
+                    <pic:cNvPr id="427608400" name=""/>
+                    <pic:cNvPicPr/>
+                  </pic:nvPicPr>
+                  <pic:blipFill>
+                    <a:blip r:embed="rId9"/>
+                    <a:stretch>
+                      <a:fillRect/>
+                    </a:stretch>
+                  </pic:blipFill>
+                  <pic:spPr>
+                    <a:xfrm>
+                      <a:off x="0" y="0"/>
+                      <a:ext cx="5760720" cy="3528060"/>
+                    </a:xfrm>
+                    <a:prstGeom prst="rect">
+                      <a:avLst/>
+                    </a:prstGeom>
+                  </pic:spPr>
+                </pic:pic>
+              </a:graphicData>
+            </a:graphic>
+          </wp:inline>
+        </w:drawing>
+      </w:r>
+    </w:p>
+    <w:p>
+      <w:pPr>
+        <w:rPr>
+          <w:b/>
+          <w:bCs/>
+          <w:u w:val="single"/>
+        </w:rPr>
+      </w:pPr>
+      <w:r>
+        <w:rPr>
+          <w:b/>
+          <w:bCs/>
+          <w:u w:val="single"/>
+        </w:rPr>
+        <w:lastRenderedPageBreak/>
+        <w:t xml:space="preserve">Page Dashboard d’accueil : </w:t>
+      </w:r>
+    </w:p>
+    <w:p>
+      <w:pPr>
+        <w:rPr>
+          <w:b/>
+          <w:bCs/>
+          <w:u w:val="single"/>
+        </w:rPr>
+      </w:pPr>
+      <w:r>
+        <w:rPr>
+          <w:b/>
+          <w:bCs/>
+          <w:u w:val="single"/>
+        </w:rPr>
+        <w:drawing>
+          <wp:inline distT="0" distB="0" distL="0" distR="0" wp14:anchorId="7455AC1B" wp14:editId="05FD1454">
+            <wp:extent cx="5423295" cy="3939540"/>
+            <wp:effectExtent l="0" t="0" r="6350" b="3810"/>
+            <wp:docPr id="432367433" name="Image 1"/>
+            <wp:cNvGraphicFramePr>
+              <a:graphicFrameLocks xmlns:a="http://schemas.openxmlformats.org/drawingml/2006/main" noChangeAspect="1"/>
+            </wp:cNvGraphicFramePr>
+            <a:graphic xmlns:a="http://schemas.openxmlformats.org/drawingml/2006/main">
+              <a:graphicData uri="http://schemas.openxmlformats.org/drawingml/2006/picture">
+                <pic:pic xmlns:pic="http://schemas.openxmlformats.org/drawingml/2006/picture">
+                  <pic:nvPicPr>
+                    <pic:cNvPr id="432367433" name=""/>
+                    <pic:cNvPicPr/>
+                  </pic:nvPicPr>
+                  <pic:blipFill>
+                    <a:blip r:embed="rId10"/>
+                    <a:stretch>
+                      <a:fillRect/>
+                    </a:stretch>
+                  </pic:blipFill>
+                  <pic:spPr>
+                    <a:xfrm>
+                      <a:off x="0" y="0"/>
+                      <a:ext cx="5428652" cy="3943432"/>
+                    </a:xfrm>
+                    <a:prstGeom prst="rect">
+                      <a:avLst/>
+                    </a:prstGeom>
+                  </pic:spPr>
+                </pic:pic>
+              </a:graphicData>
+            </a:graphic>
+          </wp:inline>
+        </w:drawing>
+      </w:r>
+    </w:p>
+    <w:p>
+      <w:pPr>
+        <w:rPr>
+          <w:b/>
+          <w:bCs/>
+          <w:u w:val="single"/>
+        </w:rPr>
+      </w:pPr>
+      <w:r>
+        <w:rPr>
+          <w:b/>
+          <w:bCs/>
+          <w:u w:val="single"/>
+        </w:rPr>
+        <w:drawing>
+          <wp:inline distT="0" distB="0" distL="0" distR="0" wp14:anchorId="679B276E" wp14:editId="4D42AF84">
+            <wp:extent cx="5760720" cy="4119880"/>
+            <wp:effectExtent l="0" t="0" r="0" b="0"/>
+            <wp:docPr id="3" name="Image 2">
+              <a:extLst xmlns:a="http://schemas.openxmlformats.org/drawingml/2006/main">
+                <a:ext uri="{FF2B5EF4-FFF2-40B4-BE49-F238E27FC236}">
+                  <a16:creationId xmlns:a16="http://schemas.microsoft.com/office/drawing/2014/main" id="{6AA46CEF-C5FC-91A0-FE24-BCFE8C126146}"/>
+                </a:ext>
+              </a:extLst>
+            </wp:docPr>
+            <wp:cNvGraphicFramePr>
+              <a:graphicFrameLocks xmlns:a="http://schemas.openxmlformats.org/drawingml/2006/main" noChangeAspect="1"/>
+            </wp:cNvGraphicFramePr>
+            <a:graphic xmlns:a="http://schemas.openxmlformats.org/drawingml/2006/main">
+              <a:graphicData uri="http://schemas.openxmlformats.org/drawingml/2006/picture">
+                <pic:pic xmlns:pic="http://schemas.openxmlformats.org/drawingml/2006/picture">
+                  <pic:nvPicPr>
+                    <pic:cNvPr id="3" name="Image 2">
+                      <a:extLst>
+                        <a:ext uri="{FF2B5EF4-FFF2-40B4-BE49-F238E27FC236}">
+                          <a16:creationId xmlns:a16="http://schemas.microsoft.com/office/drawing/2014/main" id="{6AA46CEF-C5FC-91A0-FE24-BCFE8C126146}"/>
+                        </a:ext>
+                      </a:extLst>
+                    </pic:cNvPr>
+                    <pic:cNvPicPr>
+                      <a:picLocks noChangeAspect="1"/>
+                    </pic:cNvPicPr>
+                  </pic:nvPicPr>
+                  <pic:blipFill>
+                    <a:blip r:embed="rId11"/>
+                    <a:stretch>
+                      <a:fillRect/>
+                    </a:stretch>
+                  </pic:blipFill>
+                  <pic:spPr>
+                    <a:xfrm>
+                      <a:off x="0" y="0"/>
+                      <a:ext cx="5760720" cy="4119880"/>
+                    </a:xfrm>
+                    <a:prstGeom prst="rect">
+                      <a:avLst/>
+                    </a:prstGeom>
+                  </pic:spPr>
+                </pic:pic>
+              </a:graphicData>
+            </a:graphic>
+          </wp:inline>
+        </w:drawing>
+      </w:r>
+    </w:p>
+    <w:p>
+      <w:pPr>
+        <w:rPr>
+          <w:b/>
+          <w:bCs/>
+          <w:u w:val="single"/>
+        </w:rPr>
+      </w:pPr>
+    </w:p>
+    <w:p>
+      <w:pPr>
+        <w:rPr>
+          <w:b/>
+          <w:bCs/>
+          <w:u w:val="single"/>
+        </w:rPr>
+      </w:pPr>
+      <w:r>
+        <w:rPr>
+          <w:b/>
+          <w:bCs/>
+          <w:u w:val="single"/>
+        </w:rPr>
+        <w:t xml:space="preserve">Page Calendrier : </w:t>
+      </w:r>
+    </w:p>
+    <w:p>
+      <w:pPr>
+        <w:rPr>
+          <w:b/>
+          <w:bCs/>
+          <w:u w:val="single"/>
+        </w:rPr>
+      </w:pPr>
+      <w:r>
+        <w:rPr>
+          <w:b/>
+          <w:bCs/>
+          <w:u w:val="single"/>
+        </w:rPr>
+        <w:drawing>
+          <wp:inline distT="0" distB="0" distL="0" distR="0" wp14:anchorId="1307E5E8" wp14:editId="6639B64F">
+            <wp:extent cx="5760720" cy="4100830"/>
+            <wp:effectExtent l="0" t="0" r="0" b="0"/>
+            <wp:docPr id="992671401" name="Image 2">
+              <a:extLst xmlns:a="http://schemas.openxmlformats.org/drawingml/2006/main">
+                <a:ext uri="{FF2B5EF4-FFF2-40B4-BE49-F238E27FC236}">
+                  <a16:creationId xmlns:a16="http://schemas.microsoft.com/office/drawing/2014/main" id="{B05167EA-90C6-E694-0649-B284D1BA6FDC}"/>
+                </a:ext>
+              </a:extLst>
+            </wp:docPr>
+            <wp:cNvGraphicFramePr>
+              <a:graphicFrameLocks xmlns:a="http://schemas.openxmlformats.org/drawingml/2006/main" noChangeAspect="1"/>
+            </wp:cNvGraphicFramePr>
+            <a:graphic xmlns:a="http://schemas.openxmlformats.org/drawingml/2006/main">
+              <a:graphicData uri="http://schemas.openxmlformats.org/drawingml/2006/picture">
+                <pic:pic xmlns:pic="http://schemas.openxmlformats.org/drawingml/2006/picture">
+                  <pic:nvPicPr>
+                    <pic:cNvPr id="3" name="Image 2">
+                      <a:extLst>
+                        <a:ext uri="{FF2B5EF4-FFF2-40B4-BE49-F238E27FC236}">
+                          <a16:creationId xmlns:a16="http://schemas.microsoft.com/office/drawing/2014/main" id="{B05167EA-90C6-E694-0649-B284D1BA6FDC}"/>
+                        </a:ext>
+                      </a:extLst>
+                    </pic:cNvPr>
+                    <pic:cNvPicPr>
+                      <a:picLocks noChangeAspect="1"/>
+                    </pic:cNvPicPr>
+                  </pic:nvPicPr>
+                  <pic:blipFill>
+                    <a:blip r:embed="rId12"/>
+                    <a:stretch>
+                      <a:fillRect/>
+                    </a:stretch>
+                  </pic:blipFill>
+                  <pic:spPr>
+                    <a:xfrm>
+                      <a:off x="0" y="0"/>
+                      <a:ext cx="5760720" cy="4100830"/>
+                    </a:xfrm>
+                    <a:prstGeom prst="rect">
+                      <a:avLst/>
+                    </a:prstGeom>
+                  </pic:spPr>
+                </pic:pic>
+              </a:graphicData>
+            </a:graphic>
+          </wp:inline>
+        </w:drawing>
+      </w:r>
+    </w:p>
+    <w:p>
+      <w:pPr>
+        <w:rPr>
+          <w:b/>
+          <w:bCs/>
+          <w:u w:val="single"/>
+        </w:rPr>
+      </w:pPr>
+      <w:r>
+        <w:rPr>
+          <w:b/>
+          <w:bCs/>
+          <w:u w:val="single"/>
+        </w:rPr>
+        <w:t>Page d’entrainement Dashboard :</w:t>
+      </w:r>
+    </w:p>
+    <w:p>
+      <w:pPr>
+        <w:rPr>
+          <w:b/>
+          <w:bCs/>
+          <w:u w:val="single"/>
+        </w:rPr>
+      </w:pPr>
+    </w:p>
+    <w:p>
+      <w:pPr>
+        <w:pStyle w:val="Paragraphedeliste"/>
+        <w:numPr>
+          <w:ilvl w:val="0"/>
+          <w:numId w:val="1"/>
+        </w:numPr>
+        <w:rPr>
+          <w:b/>
+          <w:bCs/>
+          <w:u w:val="single"/>
+        </w:rPr>
+      </w:pPr>
+      <w:r>
+        <w:rPr>
+          <w:b/>
+          <w:bCs/>
+          <w:u w:val="single"/>
+        </w:rPr>
+        <w:t>Page d’entrainement Exercice :</w:t>
+      </w:r>
+    </w:p>
+    <w:p>
+      <w:pPr>
+        <w:rPr>
+          <w:b/>
+          <w:bCs/>
+          <w:u w:val="single"/>
+        </w:rPr>
+      </w:pPr>
+    </w:p>
+    <w:p>
+      <w:pPr>
+        <w:pStyle w:val="Paragraphedeliste"/>
+        <w:numPr>
+          <w:ilvl w:val="0"/>
+          <w:numId w:val="1"/>
+        </w:numPr>
+        <w:rPr>
+          <w:b/>
+          <w:bCs/>
+          <w:u w:val="single"/>
+        </w:rPr>
+      </w:pPr>
+      <w:r>
+        <w:rPr>
+          <w:b/>
+          <w:bCs/>
+          <w:u w:val="single"/>
+        </w:rPr>
+        <w:t xml:space="preserve">Page d’entrainement </w:t>
+      </w:r>
+      <w:proofErr w:type="spellStart"/>
+      <w:r>
+        <w:rPr>
+          <w:b/>
+          <w:bCs/>
+          <w:u w:val="single"/>
+        </w:rPr>
+        <w:t>Mindcards</w:t>
+      </w:r>
+      <w:proofErr w:type="spellEnd"/>
+      <w:r>
+        <w:rPr>
+          <w:b/>
+          <w:bCs/>
+          <w:u w:val="single"/>
+        </w:rPr>
+        <w:t> :</w:t>
+      </w:r>
+    </w:p>
     <w:sectPr>
       <w:pgSz w:w="11906" w:h="16838"/>
       <w:pgMar w:top="1417" w:right="1417" w:bottom="1417" w:left="1417" w:header="708" w:footer="708" w:gutter="0"/>
@@ -11,6 +691,127 @@
     </w:sectPr>
   </w:body>
 </w:document>
+</file>
+
+<file path=word/numbering.xml><?xml version="1.0" encoding="utf-8"?>
+<w:numbering xmlns:wpc="http://schemas.microsoft.com/office/word/2010/wordprocessingCanvas" xmlns:cx="http://schemas.microsoft.com/office/drawing/2014/chartex" xmlns:cx1="http://schemas.microsoft.com/office/drawing/2015/9/8/chartex" xmlns:cx2="http://schemas.microsoft.com/office/drawing/2015/10/21/chartex" xmlns:cx3="http://schemas.microsoft.com/office/drawing/2016/5/9/chartex" xmlns:cx4="http://schemas.microsoft.com/office/drawing/2016/5/10/chartex" xmlns:cx5="http://schemas.microsoft.com/office/drawing/2016/5/11/chartex" xmlns:cx6="http://schemas.microsoft.com/office/drawing/2016/5/12/chartex" xmlns:cx7="http://schemas.microsoft.com/office/drawing/2016/5/13/chartex" xmlns:cx8="http://schemas.microsoft.com/office/drawing/2016/5/14/chartex" xmlns:mc="http://schemas.openxmlformats.org/markup-compatibility/2006" xmlns:aink="http://schemas.microsoft.com/office/drawing/2016/ink" xmlns:am3d="http://schemas.microsoft.com/office/drawing/2017/model3d" xmlns:o="urn:schemas-microsoft-com:office:office" xmlns:oel="http://schemas.microsoft.com/office/2019/extlst" xmlns:r="http://schemas.openxmlformats.org/officeDocument/2006/relationships" xmlns:m="http://schemas.openxmlformats.org/officeDocument/2006/math" xmlns:v="urn:schemas-microsoft-com:vml" xmlns:wp14="http://schemas.microsoft.com/office/word/2010/wordprocessingDrawing" xmlns:wp="http://schemas.openxmlformats.org/drawingml/2006/wordprocessingDrawing" xmlns:w10="urn:schemas-microsoft-com:office:word" xmlns:w="http://schemas.openxmlformats.org/wordprocessingml/2006/main" xmlns:w14="http://schemas.microsoft.com/office/word/2010/wordml" xmlns:w15="http://schemas.microsoft.com/office/word/2012/wordml" xmlns:w16cex="http://schemas.microsoft.com/office/word/2018/wordml/cex" xmlns:w16cid="http://schemas.microsoft.com/office/word/2016/wordml/cid" xmlns:w16="http://schemas.microsoft.com/office/word/2018/wordml" xmlns:w16du="http://schemas.microsoft.com/office/word/2023/wordml/word16du" xmlns:w16sdtdh="http://schemas.microsoft.com/office/word/2020/wordml/sdtdatahash" xmlns:w16sdtfl="http://schemas.microsoft.com/office/word/2024/wordml/sdtformatlock" xmlns:w16se="http://schemas.microsoft.com/office/word/2015/wordml/symex" xmlns:wpg="http://schemas.microsoft.com/office/word/2010/wordprocessingGroup" xmlns:wpi="http://schemas.microsoft.com/office/word/2010/wordprocessingInk" xmlns:wne="http://schemas.microsoft.com/office/word/2006/wordml" xmlns:wps="http://schemas.microsoft.com/office/word/2010/wordprocessingShape" mc:Ignorable="w14 w15 w16se w16cid w16 w16cex w16sdtdh w16sdtfl w16du wp14">
+  <w:abstractNum w:abstractNumId="0" w15:restartNumberingAfterBreak="0">
+    <w:nsid w:val="2AE95B3C"/>
+    <w:multiLevelType w:val="hybridMultilevel"/>
+    <w:tmpl w:val="A95A67C2"/>
+    <w:lvl w:ilvl="0" w:tplc="040C0001">
+      <w:start w:val="1"/>
+      <w:numFmt w:val="bullet"/>
+      <w:lvlText w:val=""/>
+      <w:lvlJc w:val="left"/>
+      <w:pPr>
+        <w:ind w:left="720" w:hanging="360"/>
+      </w:pPr>
+      <w:rPr>
+        <w:rFonts w:ascii="Symbol" w:hAnsi="Symbol" w:hint="default"/>
+      </w:rPr>
+    </w:lvl>
+    <w:lvl w:ilvl="1" w:tplc="040C0003" w:tentative="1">
+      <w:start w:val="1"/>
+      <w:numFmt w:val="bullet"/>
+      <w:lvlText w:val="o"/>
+      <w:lvlJc w:val="left"/>
+      <w:pPr>
+        <w:ind w:left="1440" w:hanging="360"/>
+      </w:pPr>
+      <w:rPr>
+        <w:rFonts w:ascii="Courier New" w:hAnsi="Courier New" w:cs="Courier New" w:hint="default"/>
+      </w:rPr>
+    </w:lvl>
+    <w:lvl w:ilvl="2" w:tplc="040C0005" w:tentative="1">
+      <w:start w:val="1"/>
+      <w:numFmt w:val="bullet"/>
+      <w:lvlText w:val=""/>
+      <w:lvlJc w:val="left"/>
+      <w:pPr>
+        <w:ind w:left="2160" w:hanging="360"/>
+      </w:pPr>
+      <w:rPr>
+        <w:rFonts w:ascii="Wingdings" w:hAnsi="Wingdings" w:hint="default"/>
+      </w:rPr>
+    </w:lvl>
+    <w:lvl w:ilvl="3" w:tplc="040C0001" w:tentative="1">
+      <w:start w:val="1"/>
+      <w:numFmt w:val="bullet"/>
+      <w:lvlText w:val=""/>
+      <w:lvlJc w:val="left"/>
+      <w:pPr>
+        <w:ind w:left="2880" w:hanging="360"/>
+      </w:pPr>
+      <w:rPr>
+        <w:rFonts w:ascii="Symbol" w:hAnsi="Symbol" w:hint="default"/>
+      </w:rPr>
+    </w:lvl>
+    <w:lvl w:ilvl="4" w:tplc="040C0003" w:tentative="1">
+      <w:start w:val="1"/>
+      <w:numFmt w:val="bullet"/>
+      <w:lvlText w:val="o"/>
+      <w:lvlJc w:val="left"/>
+      <w:pPr>
+        <w:ind w:left="3600" w:hanging="360"/>
+      </w:pPr>
+      <w:rPr>
+        <w:rFonts w:ascii="Courier New" w:hAnsi="Courier New" w:cs="Courier New" w:hint="default"/>
+      </w:rPr>
+    </w:lvl>
+    <w:lvl w:ilvl="5" w:tplc="040C0005" w:tentative="1">
+      <w:start w:val="1"/>
+      <w:numFmt w:val="bullet"/>
+      <w:lvlText w:val=""/>
+      <w:lvlJc w:val="left"/>
+      <w:pPr>
+        <w:ind w:left="4320" w:hanging="360"/>
+      </w:pPr>
+      <w:rPr>
+        <w:rFonts w:ascii="Wingdings" w:hAnsi="Wingdings" w:hint="default"/>
+      </w:rPr>
+    </w:lvl>
+    <w:lvl w:ilvl="6" w:tplc="040C0001" w:tentative="1">
+      <w:start w:val="1"/>
+      <w:numFmt w:val="bullet"/>
+      <w:lvlText w:val=""/>
+      <w:lvlJc w:val="left"/>
+      <w:pPr>
+        <w:ind w:left="5040" w:hanging="360"/>
+      </w:pPr>
+      <w:rPr>
+        <w:rFonts w:ascii="Symbol" w:hAnsi="Symbol" w:hint="default"/>
+      </w:rPr>
+    </w:lvl>
+    <w:lvl w:ilvl="7" w:tplc="040C0003" w:tentative="1">
+      <w:start w:val="1"/>
+      <w:numFmt w:val="bullet"/>
+      <w:lvlText w:val="o"/>
+      <w:lvlJc w:val="left"/>
+      <w:pPr>
+        <w:ind w:left="5760" w:hanging="360"/>
+      </w:pPr>
+      <w:rPr>
+        <w:rFonts w:ascii="Courier New" w:hAnsi="Courier New" w:cs="Courier New" w:hint="default"/>
+      </w:rPr>
+    </w:lvl>
+    <w:lvl w:ilvl="8" w:tplc="040C0005" w:tentative="1">
+      <w:start w:val="1"/>
+      <w:numFmt w:val="bullet"/>
+      <w:lvlText w:val=""/>
+      <w:lvlJc w:val="left"/>
+      <w:pPr>
+        <w:ind w:left="6480" w:hanging="360"/>
+      </w:pPr>
+      <w:rPr>
+        <w:rFonts w:ascii="Wingdings" w:hAnsi="Wingdings" w:hint="default"/>
+      </w:rPr>
+    </w:lvl>
+  </w:abstractNum>
+  <w:num w:numId="1" w16cid:durableId="766922050">
+    <w:abstractNumId w:val="0"/>
+  </w:num>
+</w:numbering>
 </file>
 
 <file path=word/styles.xml><?xml version="1.0" encoding="utf-8"?>
@@ -616,7 +1417,6 @@
   <w:style w:type="character" w:default="1" w:styleId="Policepardfaut">
     <w:name w:val="Default Paragraph Font"/>
     <w:uiPriority w:val="1"/>
-    <w:semiHidden/>
     <w:unhideWhenUsed/>
   </w:style>
   <w:style w:type="table" w:default="1" w:styleId="TableauNormal">
@@ -1226,4 +2026,16 @@
     </a:ext>
   </a:extLst>
 </a:theme>
+</file>
+
+<file path=customXml/item1.xml><?xml version="1.0" encoding="utf-8"?>
+<b:Sources xmlns:b="http://schemas.openxmlformats.org/officeDocument/2006/bibliography" xmlns="http://schemas.openxmlformats.org/officeDocument/2006/bibliography" SelectedStyle="\APASixthEditionOfficeOnline.xsl" StyleName="APA" Version="6"/>
+</file>
+
+<file path=customXml/itemProps1.xml><?xml version="1.0" encoding="utf-8"?>
+<ds:datastoreItem xmlns:ds="http://schemas.openxmlformats.org/officeDocument/2006/customXml" ds:itemID="{45304952-0E6D-4844-9AC5-DF7E63B947C5}">
+  <ds:schemaRefs>
+    <ds:schemaRef ds:uri="http://schemas.openxmlformats.org/officeDocument/2006/bibliography"/>
+  </ds:schemaRefs>
+</ds:datastoreItem>
 </file>
</xml_diff>